<commit_message>
docs: rapport technique et manuel en version 3 (audit du solveur, 15/07/2026)
</commit_message>
<xml_diff>
--- a/Manuel_Mise_en_Oeuvre_Python.docx
+++ b/Manuel_Mise_en_Oeuvre_Python.docx
@@ -67,12 +67,7 @@
         <w:jc w:val="center"/>
       </w:pPr>
       <w:r>
-        <w:rPr>
-          <w:color w:val="606060"/>
-          <w:sz w:val="22"/>
-          <w:szCs w:val="22"/>
-        </w:rPr>
-        <w:t xml:space="preserve">Version 2 — révisée après audit et réparation, 12 juillet 2026</w:t>
+        <w:t>Version 3 — actualisée après l'audit du solveur (coins de complémentarité), 15 juillet 2026</w:t>
       </w:r>
     </w:p>
     <w:p>
@@ -1762,6 +1757,70 @@
           </w:p>
         </w:tc>
       </w:tr>
+      <w:tr>
+        <w:tc>
+          <w:tcPr>
+            <w:tcW w:type="dxa" w:w="4200"/>
+          </w:tcPr>
+          <w:p>
+            <w:r>
+              <w:t>social_transfer(amount_total)</w:t>
+            </w:r>
+          </w:p>
+        </w:tc>
+        <w:tc>
+          <w:tcPr>
+            <w:tcW w:type="dxa" w:w="2600"/>
+          </w:tcPr>
+          <w:p>
+            <w:r>
+              <w:t>Transfert État→ménages</w:t>
+            </w:r>
+          </w:p>
+        </w:tc>
+        <w:tc>
+          <w:tcPr>
+            <w:tcW w:type="dxa" w:w="2560"/>
+          </w:tcPr>
+          <w:p>
+            <w:r>
+              <w:t>social_transfer(10.0)</w:t>
+            </w:r>
+          </w:p>
+        </w:tc>
+      </w:tr>
+      <w:tr>
+        <w:tc>
+          <w:tcPr>
+            <w:tcW w:type="dxa" w:w="4200"/>
+          </w:tcPr>
+          <w:p>
+            <w:r>
+              <w:t>input_subsidy(inputs, sectors, sub_rate)</w:t>
+            </w:r>
+          </w:p>
+        </w:tc>
+        <w:tc>
+          <w:tcPr>
+            <w:tcW w:type="dxa" w:w="2600"/>
+          </w:tcPr>
+          <w:p>
+            <w:r>
+              <w:t>Subvention d'intrants</w:t>
+            </w:r>
+          </w:p>
+        </w:tc>
+        <w:tc>
+          <w:tcPr>
+            <w:tcW w:type="dxa" w:w="2560"/>
+          </w:tcPr>
+          <w:p>
+            <w:r>
+              <w:t>input_subsidy(sectors=['A3','A4'], sub_rate=0.20)</w:t>
+            </w:r>
+          </w:p>
+        </w:tc>
+      </w:tr>
     </w:tbl>
     <w:p>
       <w:pPr>
@@ -1949,6 +2008,15 @@
           <w:szCs w:val="19"/>
         </w:rPr>
         <w:t xml:space="preserve">r1 = m.report(x)</w:t>
+      </w:r>
+    </w:p>
+    <w:p>
+      <w:pPr>
+        <w:shd w:fill="F5F5F5" w:val="clear"/>
+        <w:spacing w:after="60"/>
+      </w:pPr>
+      <w:r>
+        <w:t>Depuis la version 3, solve_path garantit l'application du choc à 100 % ou émet un avertissement explicite (plus de troncature silencieuse). Le dictionnaire info retourné contient s (fraction du choc appliquée, doit valoir 1.0), res (résidu final), idle (cellules de capital oisif) et free (produits devenus biens libres, prix épinglé au plancher). Vérifier systématiquement info['ok'] avant d'interpréter des résultats.</w:t>
       </w:r>
     </w:p>
     <w:p>
@@ -3289,15 +3357,7 @@
           </w:tcPr>
           <w:p>
             <w:r>
-              <w:rPr>
-                <w:rFonts w:ascii="Calibri" w:cs="Calibri" w:eastAsia="Calibri" w:hAnsi="Calibri"/>
-                <w:b w:val="false"/>
-                <w:bCs w:val="false"/>
-                <w:color w:val="000000"/>
-                <w:sz w:val="20"/>
-                <w:szCs w:val="20"/>
-              </w:rPr>
-              <w:t xml:space="preserve">Cascade de coins (choc extrême) : augmenter max_time, réduire step0, ou fractionner le choc ; vérifier l'économie du scénario.</w:t>
+              <w:t>Rare depuis la v3 (pivot des biens libres + Newton amorti + prédicteur sécant). Augmenter max_time ; consulter info['free'] et les avertissements ; vérifier info['ok'].</w:t>
             </w:r>
           </w:p>
         </w:tc>
@@ -3341,15 +3401,7 @@
           </w:tcPr>
           <w:p>
             <w:r>
-              <w:rPr>
-                <w:rFonts w:ascii="Calibri" w:cs="Calibri" w:eastAsia="Calibri" w:hAnsi="Calibri"/>
-                <w:b w:val="false"/>
-                <w:bCs w:val="false"/>
-                <w:color w:val="000000"/>
-                <w:sz w:val="20"/>
-                <w:szCs w:val="20"/>
-              </w:rPr>
-              <w:t xml:space="preserve">Normal (~minute/période, jacobien numérique) ; réduire T pour les itérations exploratoires.</w:t>
+              <w:t>Nettement plus rapide depuis la v3 (~secondes/période). Réduire T pour les itérations exploratoires ; augmenter pour les sentiers publiés.</w:t>
             </w:r>
           </w:p>
         </w:tc>
@@ -3452,6 +3504,28 @@
                 <w:szCs w:val="20"/>
               </w:rPr>
               <w:t xml:space="preserve">Lancer depuis le dossier du modèle ; vérifier pip install.</w:t>
+            </w:r>
+          </w:p>
+        </w:tc>
+      </w:tr>
+      <w:tr>
+        <w:tc>
+          <w:tcPr>
+            <w:tcW w:type="dxa" w:w="4600"/>
+          </w:tcPr>
+          <w:p>
+            <w:r>
+              <w:t>info['free'] non vide après un choc</w:t>
+            </w:r>
+          </w:p>
+        </w:tc>
+        <w:tc>
+          <w:tcPr>
+            <w:tcW w:type="dxa" w:w="4760"/>
+          </w:tcPr>
+          <w:p>
+            <w:r>
+              <w:t>Normal sous choc fort : produits sans consommation finale (ex. P50) dont le prix atteint le plancher (bien libre, excédent librement disposé, Walras préservé). Interpréter les prix relatifs de ces produits avec prudence (artefact des coefficients fixes).</w:t>
             </w:r>
           </w:p>
         </w:tc>
@@ -4273,6 +4347,50 @@
           </w:p>
         </w:tc>
       </w:tr>
+      <w:tr>
+        <w:tc>
+          <w:tcPr>
+            <w:tcW w:type="dxa" w:w="4000"/>
+          </w:tcPr>
+          <w:p>
+            <w:r>
+              <w:t>Simuler une subvention d'intrants (ex. engrais riz)</w:t>
+            </w:r>
+          </w:p>
+        </w:tc>
+        <w:tc>
+          <w:tcPr>
+            <w:tcW w:type="dxa" w:w="5360"/>
+          </w:tcPr>
+          <w:p>
+            <w:r>
+              <w:t>SC.input_subsidy(sectors=['A3','A4'], sub_rate=0.20) — exemples complets : run_scenario_riz.py et run_scenario_riz_pousse.py (balayage 20/50/80 %).</w:t>
+            </w:r>
+          </w:p>
+        </w:tc>
+      </w:tr>
+      <w:tr>
+        <w:tc>
+          <w:tcPr>
+            <w:tcW w:type="dxa" w:w="4000"/>
+          </w:tcPr>
+          <w:p>
+            <w:r>
+              <w:t>Vérifier le modèle après une modification</w:t>
+            </w:r>
+          </w:p>
+        </w:tc>
+        <w:tc>
+          <w:tcPr>
+            <w:tcW w:type="dxa" w:w="5360"/>
+          </w:tcPr>
+          <w:p>
+            <w:r>
+              <w:t>python -m pytest tests/ -q (5 tests, ~20 s) puis python validation_finale.py (T1-T8, ~1 min, tout doit afficher REUSSI).</w:t>
+            </w:r>
+          </w:p>
+        </w:tc>
+      </w:tr>
     </w:tbl>
     <w:p>
       <w:pPr>
@@ -4294,15 +4412,7 @@
         <w:jc w:val="both"/>
       </w:pPr>
       <w:r>
-        <w:rPr>
-          <w:rFonts w:ascii="Calibri" w:cs="Calibri" w:eastAsia="Calibri" w:hAnsi="Calibri"/>
-          <w:i/>
-          <w:iCs/>
-          <w:color w:val="606060"/>
-          <w:sz w:val="22"/>
-          <w:szCs w:val="22"/>
-        </w:rPr>
-        <w:t xml:space="preserve">— Fin du manuel (version 2) —</w:t>
+        <w:t>— Fin du manuel (version 3) —</w:t>
       </w:r>
     </w:p>
     <w:sectPr>

</xml_diff>